<commit_message>
Clash-proof save step for the scan workflow
A re-run of the first scan started from old code and failed with rebase
conflicts in generated files. The save step now runs sync_data.py: it keeps
this run's digest and seen-memory, moves to the newest branch tip, merges the
data (union of the day's stories and of the seen keys) and rebuilds docs/
with the newest code, then commits and pushes, retrying if the branch moved.

Co-Authored-By: Claude Opus 5.5 <noreply@anthropic.com>
Claude-Session: https://claude.ai/code/session_01N2cbJQGUUZpwz34g4NBxNT
</commit_message>
<xml_diff>
--- a/docs/reports/site-report.docx
+++ b/docs/reports/site-report.docx
@@ -28,7 +28,7 @@
           <w:color w:val="5B6573"/>
           <w:sz w:val="19"/>
         </w:rPr>
-        <w:t>ISSMGE Magazine · generated 24 October 2026, 12:45 UTC · updated automatically after every scan</w:t>
+        <w:t>ISSMGE Magazine · generated 24 October 2026, 12:52 UTC · updated automatically after every scan</w:t>
       </w:r>
     </w:p>
     <w:p>
@@ -1761,6 +1761,50 @@
           <w:b/>
           <w:color w:val="23466B"/>
         </w:rPr>
+        <w:t>2026-10-24 · No more key prompts; clash-proof saving</w:t>
+      </w:r>
+    </w:p>
+    <w:p>
+      <w:pPr>
+        <w:pStyle w:val="ListBullet"/>
+      </w:pPr>
+      <w:r>
+        <w:t>The website no longer asks for a GitHub token or an Anthropic key. Scan now opens the scan's page on GitHub, where you press Run workflow, and the website then follows the scan and says when the new digest is ready.</w:t>
+      </w:r>
+    </w:p>
+    <w:p>
+      <w:pPr>
+        <w:pStyle w:val="ListBullet"/>
+      </w:pPr>
+      <w:r>
+        <w:t>The AI assistant now talks to a small connector in the editor's own Google account (assistant/bridge.gs), which reads the Anthropic key from the editor's private Google Doc. The key never reaches the website or the repository. Until the connector is set up, the assistant page says so instead of asking for a key.</w:t>
+      </w:r>
+    </w:p>
+    <w:p>
+      <w:pPr>
+        <w:pStyle w:val="ListBullet"/>
+      </w:pPr>
+      <w:r>
+        <w:t>Saving a scan can no longer fail with merge conflicts. A re-run of the first scan on 24 October started from old code and clashed with the newer website; the save step now puts each run's data on the newest version of the site and rebuilds the pages from it.</w:t>
+      </w:r>
+    </w:p>
+    <w:p>
+      <w:pPr>
+        <w:pStyle w:val="ListBullet"/>
+      </w:pPr>
+      <w:r>
+        <w:t>Queued or re-run scans start from the newest version of the repository, not the commit that queued them.</w:t>
+      </w:r>
+    </w:p>
+    <w:p>
+      <w:pPr>
+        <w:spacing w:before="160"/>
+      </w:pPr>
+      <w:r>
+        <w:rPr>
+          <w:b/>
+          <w:color w:val="23466B"/>
+        </w:rPr>
         <w:t>2026-10-24 · Multilingual categorisation, Scan button, Excel workbooks, AI assistant and new design</w:t>
       </w:r>
     </w:p>
@@ -1940,7 +1984,7 @@
         <w:pStyle w:val="ListBullet"/>
       </w:pPr>
       <w:r>
-        <w:t>To use the Scan now button and the AI assistant, add a GitHub token and an Anthropic key under Settings (gear icon) on the website, on each device you use.</w:t>
+        <w:t>Set up the AI assistant connector in Google (README, "AI assistant") and put its web address in config.yaml under assistant endpoint.</w:t>
       </w:r>
     </w:p>
     <w:sectPr>

</xml_diff>

<commit_message>
Connect the AI assistant to the editor's Google connector; clearer connector errors
- config.yaml: assistant endpoint set to the deployed web app
- bridge.gs: explain an unreplaced KEY_DOC placeholder or a key document
  that cannot be opened, instead of Google's raw error
- assistant page: show the connector's reported problem, or deployment
  checks when it does not answer, in the conversation

Co-Authored-By: Claude Opus 5.5 <noreply@anthropic.com>
Claude-Session: https://claude.ai/code/session_01N2cbJQGUUZpwz34g4NBxNT
</commit_message>
<xml_diff>
--- a/docs/reports/site-report.docx
+++ b/docs/reports/site-report.docx
@@ -28,7 +28,7 @@
           <w:color w:val="5B6573"/>
           <w:sz w:val="19"/>
         </w:rPr>
-        <w:t>ISSMGE Magazine · generated 24 October 2026, 12:52 UTC · updated automatically after every scan</w:t>
+        <w:t>ISSMGE Magazine · generated 24 October 2026, 13:14 UTC · updated automatically after every scan</w:t>
       </w:r>
     </w:p>
     <w:p>
@@ -1798,6 +1798,14 @@
     </w:p>
     <w:p>
       <w:pPr>
+        <w:pStyle w:val="ListBullet"/>
+      </w:pPr>
+      <w:r>
+        <w:t>The AI assistant was connected to the editor's Google connector. If the connector reports a problem (for example it cannot find or open the key document), the assistant page now shows the reason and what to do.</w:t>
+      </w:r>
+    </w:p>
+    <w:p>
+      <w:pPr>
         <w:spacing w:before="160"/>
       </w:pPr>
       <w:r>
@@ -1977,14 +1985,6 @@
       </w:pPr>
       <w:r>
         <w:t>Check that the ANTHROPIC_API_KEY secret is accepted (the first scan reported it as rejected).</w:t>
-      </w:r>
-    </w:p>
-    <w:p>
-      <w:pPr>
-        <w:pStyle w:val="ListBullet"/>
-      </w:pPr>
-      <w:r>
-        <w:t>Set up the AI assistant connector in Google (README, "AI assistant") and put its web address in config.yaml under assistant endpoint.</w:t>
       </w:r>
     </w:p>
     <w:sectPr>

</xml_diff>

<commit_message>
Fix the reviewed selection problems before release
- Election excludes no longer catch real landslide news ('killed in a
  landslide', 'blocked by a landslide'); bare 'lng' and '経済' replaced by
  specific phrases
- Same-event filter: place names counted per word, headlines that each name
  a place the other does not, or share no significant word, are never
  merged, and re-wordings are grouped transitively (union-find), keeping the
  best story of each group
- Same-day merges re-score the morning's keyword-ranked stories without the
  old language bonus and drop those that no longer pass
- A clear note when every Claude batch fails
- Workbook Top 10 hides an empty digest date

Co-Authored-By: Claude Opus 5.5 <noreply@anthropic.com>
Claude-Session: https://claude.ai/code/session_01N2cbJQGUUZpwz34g4NBxNT
</commit_message>
<xml_diff>
--- a/docs/reports/site-report.docx
+++ b/docs/reports/site-report.docx
@@ -28,7 +28,7 @@
           <w:color w:val="5B6573"/>
           <w:sz w:val="19"/>
         </w:rPr>
-        <w:t>ISSMGE Magazine · generated 24 October 2026, 13:25 UTC · updated automatically after every scan</w:t>
+        <w:t>ISSMGE Magazine · generated 24 October 2026, 13:40 UTC · updated automatically after every scan</w:t>
       </w:r>
     </w:p>
     <w:p>
@@ -1882,6 +1882,74 @@
           <w:b/>
           <w:color w:val="23466B"/>
         </w:rPr>
+        <w:t>2026-10-24 · Balanced digests, same-event merging, interactive Excel workbook</w:t>
+      </w:r>
+    </w:p>
+    <w:p>
+      <w:pPr>
+        <w:pStyle w:val="ListBullet"/>
+      </w:pPr>
+      <w:r>
+        <w:t>Every digest now spans the magazine's themes. No theme may take more than 30 % of the stories, and themes take turns, so a flood of one kind of story (on 24 October, landslides) can no longer fill the whole digest. A re-scan on the same day re-balances the morning's digest.</w:t>
+      </w:r>
+    </w:p>
+    <w:p>
+      <w:pPr>
+        <w:pStyle w:val="ListBullet"/>
+      </w:pPr>
+      <w:r>
+        <w:t>Several outlets reporting the same event (for example eight reports of one landslide in Moniquirá, Colombia) are merged into one story.</w:t>
+      </w:r>
+    </w:p>
+    <w:p>
+      <w:pPr>
+        <w:pStyle w:val="ListBullet"/>
+      </w:pPr>
+      <w:r>
+        <w:t>Chinese, Japanese, Arabic and Hindi headlines are no longer thrown away as false duplicates of each other.</w:t>
+      </w:r>
+    </w:p>
+    <w:p>
+      <w:pPr>
+        <w:pStyle w:val="ListBullet"/>
+      </w:pPr>
+      <w:r>
+        <w:t>English stories are no longer crowded out by foreign-language results; the language bonus only helps foreign headlines reach Claude.</w:t>
+      </w:r>
+    </w:p>
+    <w:p>
+      <w:pPr>
+        <w:pStyle w:val="ListBullet"/>
+      </w:pPr>
+      <w:r>
+        <w:t>Keyword false matches removed after review - election "landslides", LNG "liquefaction", market slumps (Italian frana, Chinese 滑坡), insolvencies, pile-ups, building land (German Baugrund) and other false friends - and inflected forms such as tunnelling, frane and Erdrutsche added.</w:t>
+      </w:r>
+    </w:p>
+    <w:p>
+      <w:pPr>
+        <w:pStyle w:val="ListBullet"/>
+      </w:pPr>
+      <w:r>
+        <w:t>If Anthropic rejects the API key, the digest notes now say why (for example a key that is cut short, an admin key or a subscription token) without showing the key.</w:t>
+      </w:r>
+    </w:p>
+    <w:p>
+      <w:pPr>
+        <w:pStyle w:val="ListBullet"/>
+      </w:pPr>
+      <w:r>
+        <w:t>The Excel workbooks were redesigned - a Start here sheet, an interactive dashboard whose figures, charts and Top 10 follow dropdown selectors, planning columns (Status, Assigned to, Editor notes), a By theme reading view with collapsible sections, and a Sources sheet.</w:t>
+      </w:r>
+    </w:p>
+    <w:p>
+      <w:pPr>
+        <w:spacing w:before="160"/>
+      </w:pPr>
+      <w:r>
+        <w:rPr>
+          <w:b/>
+          <w:color w:val="23466B"/>
+        </w:rPr>
         <w:t>2026-10-24 · No more key prompts; clash-proof saving</w:t>
       </w:r>
     </w:p>

</xml_diff>

<commit_message>
Save step keeps the run's rebalanced digest; rebalance today's digest
sync_data.py merged every story of the copy on main back into the run's
digest, undoing the theme balancing and same-event merging done by the scan
(today's digest grew to 93 stories, 81 of them Hazards). It now keeps the
run's digest unchanged when nobody else changed it during the run, and only
when another run saved the same day does it merge the two and re-balance
them (new scanner.py --rebalance). Today's digest is re-balanced.

Co-Authored-By: Claude Opus 5.5 <noreply@anthropic.com>
Claude-Session: https://claude.ai/code/session_01N2cbJQGUUZpwz34g4NBxNT
</commit_message>
<xml_diff>
--- a/docs/reports/site-report.docx
+++ b/docs/reports/site-report.docx
@@ -28,7 +28,7 @@
           <w:color w:val="5B6573"/>
           <w:sz w:val="19"/>
         </w:rPr>
-        <w:t>ISSMGE Magazine · generated 24 October 2026, 13:43 UTC · updated automatically after every scan</w:t>
+        <w:t>ISSMGE Magazine · generated 24 October 2026, 13:45 UTC · updated automatically after every scan</w:t>
       </w:r>
     </w:p>
     <w:p>
@@ -163,7 +163,7 @@
               <w:rPr>
                 <w:sz w:val="19"/>
               </w:rPr>
-              <w:t>93</w:t>
+              <w:t>30</w:t>
             </w:r>
           </w:p>
         </w:tc>
@@ -255,7 +255,7 @@
               <w:rPr>
                 <w:sz w:val="19"/>
               </w:rPr>
-              <w:t>93</w:t>
+              <w:t>30</w:t>
             </w:r>
           </w:p>
         </w:tc>
@@ -404,12 +404,12 @@
       <w:r>
         <w:rPr>
           <w:b/>
-          <w:color w:val="B5560E"/>
+          <w:color w:val="1E7B4F"/>
         </w:rPr>
-        <w:t xml:space="preserve">⚠ </w:t>
+        <w:t xml:space="preserve">✔ </w:t>
       </w:r>
       <w:r>
-        <w:t>Theme balance: 5 themes covered; the largest is Hazards &amp; Resilience with 81 of 93 stories (87%).</w:t>
+        <w:t>Theme balance: 5 themes covered; the largest is Hazards &amp; Resilience with 18 of 30 stories (60%).</w:t>
       </w:r>
     </w:p>
     <w:p>
@@ -424,7 +424,7 @@
         <w:t xml:space="preserve">• </w:t>
       </w:r>
       <w:r>
-        <w:t>64 different outlets contributed; the most frequent was Vietnam.vn (22 stories).</w:t>
+        <w:t>23 different outlets contributed; the most frequent was Vietnam.vn (7 stories).</w:t>
       </w:r>
     </w:p>
     <w:p>
@@ -439,7 +439,7 @@
         <w:t xml:space="preserve">• </w:t>
       </w:r>
       <w:r>
-        <w:t>82 stories came from non-English Google News editions.</w:t>
+        <w:t>21 stories came from non-English Google News editions.</w:t>
       </w:r>
     </w:p>
     <w:p>
@@ -454,7 +454,7 @@
         <w:t xml:space="preserve">• </w:t>
       </w:r>
       <w:r>
-        <w:t>23 stories were rated 4 or 5 out of 5.</w:t>
+        <w:t>22 stories were rated 4 or 5 out of 5.</w:t>
       </w:r>
     </w:p>
     <w:p>
@@ -1544,7 +1544,7 @@
               <w:rPr>
                 <w:sz w:val="19"/>
               </w:rPr>
-              <w:t>93</w:t>
+              <w:t>30</w:t>
             </w:r>
           </w:p>
         </w:tc>
@@ -1716,7 +1716,7 @@
               <w:rPr>
                 <w:sz w:val="19"/>
               </w:rPr>
-              <w:t>1%</w:t>
+              <w:t>3%</w:t>
             </w:r>
           </w:p>
         </w:tc>
@@ -1764,7 +1764,7 @@
               <w:rPr>
                 <w:sz w:val="19"/>
               </w:rPr>
-              <w:t>81</w:t>
+              <w:t>18</w:t>
             </w:r>
           </w:p>
         </w:tc>
@@ -1779,7 +1779,7 @@
               <w:rPr>
                 <w:sz w:val="19"/>
               </w:rPr>
-              <w:t>87%</w:t>
+              <w:t>60%</w:t>
             </w:r>
           </w:p>
         </w:tc>
@@ -1794,7 +1794,7 @@
               <w:rPr>
                 <w:sz w:val="19"/>
               </w:rPr>
-              <w:t>16</w:t>
+              <w:t>15</w:t>
             </w:r>
           </w:p>
         </w:tc>
@@ -1841,7 +1841,7 @@
               <w:rPr>
                 <w:sz w:val="19"/>
               </w:rPr>
-              <w:t>5%</w:t>
+              <w:t>17%</w:t>
             </w:r>
           </w:p>
         </w:tc>
@@ -1904,7 +1904,7 @@
               <w:rPr>
                 <w:sz w:val="19"/>
               </w:rPr>
-              <w:t>4%</w:t>
+              <w:t>13%</w:t>
             </w:r>
           </w:p>
         </w:tc>
@@ -1966,7 +1966,7 @@
               <w:rPr>
                 <w:sz w:val="19"/>
               </w:rPr>
-              <w:t>2%</w:t>
+              <w:t>7%</w:t>
             </w:r>
           </w:p>
         </w:tc>

</xml_diff>

<commit_message>
Save step carries issue briefs and merges papers; report gains features, research and briefs sections
Co-Authored-By: Claude Opus 5.5 <noreply@anthropic.com>
Claude-Session: https://claude.ai/code/session_01N2cbJQGUUZpwz34g4NBxNT
</commit_message>
<xml_diff>
--- a/docs/reports/site-report.docx
+++ b/docs/reports/site-report.docx
@@ -28,7 +28,7 @@
           <w:color w:val="5B6573"/>
           <w:sz w:val="19"/>
         </w:rPr>
-        <w:t>ISSMGE Magazine · generated 24 October 2026, 13:46 UTC · updated automatically after every scan</w:t>
+        <w:t>ISSMGE Magazine · generated 24 October 2026, 13:48 UTC · updated automatically after every scan</w:t>
       </w:r>
     </w:p>
     <w:p>
@@ -356,6 +356,157 @@
       </w:tr>
     </w:tbl>
     <w:p/>
+    <w:p>
+      <w:pPr>
+        <w:pStyle w:val="Heading1"/>
+      </w:pPr>
+      <w:r>
+        <w:rPr>
+          <w:color w:val="16324F"/>
+        </w:rPr>
+        <w:t>What the website does</w:t>
+      </w:r>
+    </w:p>
+    <w:p>
+      <w:pPr>
+        <w:pStyle w:val="ListBullet"/>
+      </w:pPr>
+      <w:r>
+        <w:rPr>
+          <w:b/>
+        </w:rPr>
+        <w:t xml:space="preserve">Daily scan: </w:t>
+      </w:r>
+      <w:r>
+        <w:t>every day at 05:00 Cairo time, and on demand with Scan now, the scanner reads specialist, society and trade-press websites, worldwide Google News searches in English and 16 other languages, and new papers from geotechnical journals.</w:t>
+      </w:r>
+    </w:p>
+    <w:p>
+      <w:pPr>
+        <w:pStyle w:val="ListBullet"/>
+      </w:pPr>
+      <w:r>
+        <w:rPr>
+          <w:b/>
+        </w:rPr>
+        <w:t xml:space="preserve">Categorisation: </w:t>
+      </w:r>
+      <w:r>
+        <w:t>every headline, in any covered language, is scored against weighted geotechnical keywords and filed under one of the magazine's eight themes; Claude then rates its geotechnical substance (1-5), confirms the theme, suggests an editorial use, writes a magazine angle and translates foreign headlines.</w:t>
+      </w:r>
+    </w:p>
+    <w:p>
+      <w:pPr>
+        <w:pStyle w:val="ListBullet"/>
+      </w:pPr>
+      <w:r>
+        <w:rPr>
+          <w:b/>
+        </w:rPr>
+        <w:t xml:space="preserve">Balanced digests: </w:t>
+      </w:r>
+      <w:r>
+        <w:t>no theme may take more than 30 % of a digest, and several outlets reporting the same event are merged into one story.</w:t>
+      </w:r>
+    </w:p>
+    <w:p>
+      <w:pPr>
+        <w:pStyle w:val="ListBullet"/>
+      </w:pPr>
+      <w:r>
+        <w:rPr>
+          <w:b/>
+        </w:rPr>
+        <w:t xml:space="preserve">Archive: </w:t>
+      </w:r>
+      <w:r>
+        <w:t>every digest is kept permanently and grouped into three-month issue windows that follow the magazine's cycle, each with an issue page.</w:t>
+      </w:r>
+    </w:p>
+    <w:p>
+      <w:pPr>
+        <w:pStyle w:val="ListBullet"/>
+      </w:pPr>
+      <w:r>
+        <w:rPr>
+          <w:b/>
+        </w:rPr>
+        <w:t xml:space="preserve">Issue brief: </w:t>
+      </w:r>
+      <w:r>
+        <w:t>for each issue window Claude drafts a Word brief for the editorial meeting - a proposed line-up per theme, feature leads, Academia-to-Industry topics, a regional-balance check and gaps worth covering. Drafts appear in the last weeks of each quarter, a final brief after it closes, and on demand from the issue page.</w:t>
+      </w:r>
+    </w:p>
+    <w:p>
+      <w:pPr>
+        <w:pStyle w:val="ListBullet"/>
+      </w:pPr>
+      <w:r>
+        <w:rPr>
+          <w:b/>
+        </w:rPr>
+        <w:t xml:space="preserve">Research papers: </w:t>
+      </w:r>
+      <w:r>
+        <w:t>new papers from journals such as Géotechnique, Canadian Geotechnical Journal, ASCE JGGE, Soils and Foundations and Acta Geotechnica arrive through Crossref, with a one-line note on why each matters for practice.</w:t>
+      </w:r>
+    </w:p>
+    <w:p>
+      <w:pPr>
+        <w:pStyle w:val="ListBullet"/>
+      </w:pPr>
+      <w:r>
+        <w:rPr>
+          <w:b/>
+        </w:rPr>
+        <w:t xml:space="preserve">Trends: </w:t>
+      </w:r>
+      <w:r>
+        <w:t>a page charting stories per month and per quarter by theme, theme shares over time, rising keywords, regions, editorial uses and sources.</w:t>
+      </w:r>
+    </w:p>
+    <w:p>
+      <w:pPr>
+        <w:pStyle w:val="ListBullet"/>
+      </w:pPr>
+      <w:r>
+        <w:rPr>
+          <w:b/>
+        </w:rPr>
+        <w:t xml:space="preserve">Search and AI assistant: </w:t>
+      </w:r>
+      <w:r>
+        <w:t>search every archived story with filters, or ask the AI assistant, which can also read attached PDF and Word documents.</w:t>
+      </w:r>
+    </w:p>
+    <w:p>
+      <w:pPr>
+        <w:pStyle w:val="ListBullet"/>
+      </w:pPr>
+      <w:r>
+        <w:rPr>
+          <w:b/>
+        </w:rPr>
+        <w:t xml:space="preserve">Excel workbooks: </w:t>
+      </w:r>
+      <w:r>
+        <w:t>one per issue window and one for the whole archive, with an interactive dashboard, planning columns and a reading view by theme.</w:t>
+      </w:r>
+    </w:p>
+    <w:p>
+      <w:pPr>
+        <w:pStyle w:val="ListBullet"/>
+      </w:pPr>
+      <w:r>
+        <w:rPr>
+          <w:b/>
+        </w:rPr>
+        <w:t xml:space="preserve">Website report: </w:t>
+      </w:r>
+      <w:r>
+        <w:t>this document, rebuilt after every scan.</w:t>
+      </w:r>
+    </w:p>
     <w:p>
       <w:pPr>
         <w:pStyle w:val="Heading1"/>
@@ -1995,7 +2146,39 @@
         <w:rPr>
           <w:color w:val="16324F"/>
         </w:rPr>
-        <w:t>6. Change log</w:t>
+        <w:t>6. Research papers (Q4 2026)</w:t>
+      </w:r>
+    </w:p>
+    <w:p>
+      <w:r>
+        <w:t>No research papers have been collected in this issue window yet.</w:t>
+      </w:r>
+    </w:p>
+    <w:p>
+      <w:pPr>
+        <w:pStyle w:val="Heading1"/>
+      </w:pPr>
+      <w:r>
+        <w:rPr>
+          <w:color w:val="16324F"/>
+        </w:rPr>
+        <w:t>7. Issue briefs</w:t>
+      </w:r>
+    </w:p>
+    <w:p>
+      <w:r>
+        <w:t>No issue brief has been generated yet. Drafts appear automatically in the last weeks of each quarter, a final brief right after it closes, and any time from the issue page.</w:t>
+      </w:r>
+    </w:p>
+    <w:p>
+      <w:pPr>
+        <w:pStyle w:val="Heading1"/>
+      </w:pPr>
+      <w:r>
+        <w:rPr>
+          <w:color w:val="16324F"/>
+        </w:rPr>
+        <w:t>8. Change log</w:t>
       </w:r>
     </w:p>
     <w:p>
@@ -2282,7 +2465,7 @@
         <w:rPr>
           <w:color w:val="16324F"/>
         </w:rPr>
-        <w:t>7. Open items and recommendations</w:t>
+        <w:t>9. Open items and recommendations</w:t>
       </w:r>
     </w:p>
     <w:p>

</xml_diff>

<commit_message>
Rebuild after integrating brief, sources and trends
</commit_message>
<xml_diff>
--- a/docs/reports/site-report.docx
+++ b/docs/reports/site-report.docx
@@ -28,7 +28,7 @@
           <w:color w:val="5B6573"/>
           <w:sz w:val="19"/>
         </w:rPr>
-        <w:t>ISSMGE Magazine · generated 24 October 2026, 13:48 UTC · updated automatically after every scan</w:t>
+        <w:t>ISSMGE Magazine · generated 24 October 2026, 15:21 UTC · updated automatically after every scan</w:t>
       </w:r>
     </w:p>
     <w:p>
@@ -349,7 +349,7 @@
               <w:rPr>
                 <w:sz w:val="19"/>
               </w:rPr>
-              <w:t>18 of 26</w:t>
+              <w:t>18 of 19</w:t>
             </w:r>
           </w:p>
         </w:tc>
@@ -545,7 +545,7 @@
         <w:t xml:space="preserve">⚠ </w:t>
       </w:r>
       <w:r>
-        <w:t>8 of 26 websites were read successfully; 18 failed (see Source health).</w:t>
+        <w:t>1 of 19 websites were read successfully; 18 failed (see Source health).</w:t>
       </w:r>
     </w:p>
     <w:p>

</xml_diff>

<commit_message>
Follow-ups from verification: Geo-Institute site search, ASCE careers pages, Korean place names and particles, brief heading kept with its table
Co-Authored-By: Claude Opus 5.5 <noreply@anthropic.com>
Claude-Session: https://claude.ai/code/session_01N2cbJQGUUZpwz34g4NBxNT
</commit_message>
<xml_diff>
--- a/docs/reports/site-report.docx
+++ b/docs/reports/site-report.docx
@@ -28,7 +28,7 @@
           <w:color w:val="5B6573"/>
           <w:sz w:val="19"/>
         </w:rPr>
-        <w:t>ISSMGE Magazine · generated 24 October 2026, 15:21 UTC · updated automatically after every scan</w:t>
+        <w:t>ISSMGE Magazine · generated 24 October 2026, 16:33 UTC · updated automatically after every scan</w:t>
       </w:r>
     </w:p>
     <w:p>
@@ -2190,6 +2190,66 @@
           <w:b/>
           <w:color w:val="23466B"/>
         </w:rPr>
+        <w:t>2026-10-24 · Issue brief, research papers, fixed sources, five more languages and a Trends page</w:t>
+      </w:r>
+    </w:p>
+    <w:p>
+      <w:pPr>
+        <w:pStyle w:val="ListBullet"/>
+      </w:pPr>
+      <w:r>
+        <w:t>Issue brief (Word) - for each issue window Claude drafts a brief for the editorial meeting - an overview, a proposed line-up per theme, feature leads with the kinds of experts to approach, Academia-to-Industry topics, a regional-balance check, gaps worth covering and a watch list. Drafts appear in the last 21 days of each quarter and are refreshed weekly, the final brief follows the day after the quarter closes, and Generate / update brief on the issue page starts one at any time.</w:t>
+      </w:r>
+    </w:p>
+    <w:p>
+      <w:pPr>
+        <w:pStyle w:val="ListBullet"/>
+      </w:pPr>
+      <w:r>
+        <w:t>Research papers - each scan collects new papers from 25 geotechnical journals through Crossref (Géotechnique, Canadian Geotechnical Journal, ASCE JGGE, Soils and Foundations, Acta Geotechnica and others), with a one-line note from Claude on why each matters for practice. They appear under New research on digest and issue pages, in Search, in the Excel Research sheet and in the issue brief.</w:t>
+      </w:r>
+    </w:p>
+    <w:p>
+      <w:pPr>
+        <w:pStyle w:val="ListBullet"/>
+      </w:pPr>
+      <w:r>
+        <w:t>All 18 failing sources were re-tested from GitHub's network with the new Check feeds workflow. Tunnels &amp; Tunnelling, Rail Technology Magazine and ENR now have working feeds, TunnelTalk is replaced by Tunnelling Journal, Ground Engineering was added, and sites that block automated readers (ISSMGE, ICE, GEER, USGS, GeoEngineer, FHWA, ReliefWeb, Railway Gazette, Rail Business UK, Construction Week, International Construction) are read through Google News searches limited to the site.</w:t>
+      </w:r>
+    </w:p>
+    <w:p>
+      <w:pPr>
+        <w:pStyle w:val="ListBullet"/>
+      </w:pPr>
+      <w:r>
+        <w:t>Five more languages - Vietnamese, Korean, Russian and Polish Google News editions, Persian through six Persian news sites (Google News has no Persian edition), and Spanish-language editions for Colombia, Chile, Peru and Argentina. About 470 new keywords, with word-stem matching for inflected languages.</w:t>
+      </w:r>
+    </w:p>
+    <w:p>
+      <w:pPr>
+        <w:pStyle w:val="ListBullet"/>
+      </w:pPr>
+      <w:r>
+        <w:t>Trends page - stories per month and per quarter by theme, theme shares over time, rising keywords, regions, editorial uses, relevance and sources, with hover details, table views and a CSV download.</w:t>
+      </w:r>
+    </w:p>
+    <w:p>
+      <w:pPr>
+        <w:pStyle w:val="ListBullet"/>
+      </w:pPr>
+      <w:r>
+        <w:t>The Word website report now opens with a summary of what the website does and has sections for research papers and issue briefs.</w:t>
+      </w:r>
+    </w:p>
+    <w:p>
+      <w:pPr>
+        <w:spacing w:before="160"/>
+      </w:pPr>
+      <w:r>
+        <w:rPr>
+          <w:b/>
+          <w:color w:val="23466B"/>
+        </w:rPr>
         <w:t>2026-10-24 · Balanced digests, same-event merging, interactive Excel workbook</w:t>
       </w:r>
     </w:p>
@@ -2473,15 +2533,7 @@
         <w:pStyle w:val="ListBullet"/>
       </w:pPr>
       <w:r>
-        <w:t>Replace the addresses of failing websites with their RSS feeds (see Source health).</w:t>
-      </w:r>
-    </w:p>
-    <w:p>
-      <w:pPr>
-        <w:pStyle w:val="ListBullet"/>
-      </w:pPr>
-      <w:r>
-        <w:t>Check that the ANTHROPIC_API_KEY secret is accepted (the first scan reported it as rejected).</w:t>
+        <w:t>Check the Source health section after the next scans; any site still failing can be tested with the Check feeds workflow.</w:t>
       </w:r>
     </w:p>
     <w:sectPr>

</xml_diff>

<commit_message>
Catch-up scans when GitHub delays or drops the 05:00 run
GitHub did not start the scheduled scan on 25 October. Two catch-up runs
(05:37 and 09:13 UTC) now scan only if the day has no digest yet. The
repository is checked out before the time check so it can see that.

Co-Authored-By: Claude Opus 5.5 <noreply@anthropic.com>
Claude-Session: https://claude.ai/code/session_01N2cbJQGUUZpwz34g4NBxNT
</commit_message>
<xml_diff>
--- a/docs/reports/site-report.docx
+++ b/docs/reports/site-report.docx
@@ -28,7 +28,7 @@
           <w:color w:val="5B6573"/>
           <w:sz w:val="19"/>
         </w:rPr>
-        <w:t>ISSMGE Magazine · generated 25 October 2026, 01:47 UTC · updated automatically after every scan</w:t>
+        <w:t>ISSMGE Magazine · generated 25 October 2026, 03:12 UTC · updated automatically after every scan</w:t>
       </w:r>
     </w:p>
     <w:p>
@@ -3385,6 +3385,26 @@
           <w:b/>
           <w:color w:val="23466B"/>
         </w:rPr>
+        <w:t>2026-10-25 · Catch-up scans</w:t>
+      </w:r>
+    </w:p>
+    <w:p>
+      <w:pPr>
+        <w:pStyle w:val="ListBullet"/>
+      </w:pPr>
+      <w:r>
+        <w:t>GitHub did not start the 05:00 scan on 25 October (it delays scheduled runs at the start of the hour and sometimes drops them). Two catch-up runs, mid-morning and at midday Cairo time, now scan only if the day has no digest yet, so a missed morning scan is made up the same day.</w:t>
+      </w:r>
+    </w:p>
+    <w:p>
+      <w:pPr>
+        <w:spacing w:before="160"/>
+      </w:pPr>
+      <w:r>
+        <w:rPr>
+          <w:b/>
+          <w:color w:val="23466B"/>
+        </w:rPr>
         <w:t>2026-10-24 · World map, developing stories, events calendar, alerts and weekly summary</w:t>
       </w:r>
     </w:p>

</xml_diff>

<commit_message>
Events calendar: pending steps run before the write-up; README and change log
A paused turn that ends with a search or fetch still to run may not be
followed by a system message, so that step runs first. A busy write-up
now retries the next day, the note says whether Claude really wrote up,
Opus 5 and Fable 5.1 prices are known for the limit, and the README and
change log describe what a refresh costs and how it is kept down.

Co-Authored-By: Claude Opus 5.5 <noreply@anthropic.com>
Claude-Session: https://claude.ai/code/session_01N2cbJQGUUZpwz34g4NBxNT
</commit_message>
<xml_diff>
--- a/docs/reports/site-report.docx
+++ b/docs/reports/site-report.docx
@@ -28,7 +28,7 @@
           <w:color w:val="5B6573"/>
           <w:sz w:val="19"/>
         </w:rPr>
-        <w:t>ISSMGE Magazine · generated 25 October 2026, 03:20 UTC · updated automatically after every scan</w:t>
+        <w:t>ISSMGE Magazine · generated 25 October 2026, 05:58 UTC · updated automatically after every scan</w:t>
       </w:r>
     </w:p>
     <w:p>
@@ -4071,7 +4071,15 @@
           <w:b/>
           <w:color w:val="23466B"/>
         </w:rPr>
-        <w:t>2026-10-25 · Catch-up scans</w:t>
+        <w:t>2026-10-25 · Catch-up scans and a cheaper events refresh</w:t>
+      </w:r>
+    </w:p>
+    <w:p>
+      <w:pPr>
+        <w:pStyle w:val="ListBullet"/>
+      </w:pPr>
+      <w:r>
+        <w:t>The first events calendar refresh ran out of Anthropic credit part-way. A refresh now caps how much of each page Claude reads, uses prompt caching, stops near a spending limit (max_cost_usd, US$3) and has Claude write up the events found so far, keeps its notes when a later step fails, retries the next day when Claude was only busy, and ends its log with the tokens, searches and estimated cost.</w:t>
       </w:r>
     </w:p>
     <w:p>

</xml_diff>

<commit_message>
Events calendar and e-mail (2026-10-25)
</commit_message>
<xml_diff>
--- a/docs/reports/site-report.docx
+++ b/docs/reports/site-report.docx
@@ -28,7 +28,7 @@
           <w:color w:val="5B6573"/>
           <w:sz w:val="19"/>
         </w:rPr>
-        <w:t>ISSMGE Magazine · generated 25 October 2026, 05:59 UTC · updated automatically after every scan</w:t>
+        <w:t>ISSMGE Magazine · generated 25 October 2026, 07:13 UTC · updated automatically after every scan</w:t>
       </w:r>
     </w:p>
     <w:p>
@@ -3485,14 +3485,164 @@
     </w:p>
     <w:p>
       <w:r>
-        <w:t>The calendar holds 6 events: 6 from the editors' list (data/events.yaml) and 0 found by the weekly refresh, which has not run yet (it needs the ANTHROPIC_API_KEY secret and Anthropic's web search and web fetch tools).</w:t>
+        <w:t>The calendar holds 45 events: 6 from the editors' list (data/events.yaml) and 39 found by the weekly refresh, last refreshed on 25 Oct 2026.</w:t>
       </w:r>
     </w:p>
     <w:p>
+      <w:pPr>
+        <w:pStyle w:val="Heading2"/>
+      </w:pPr>
       <w:r>
-        <w:t>No deadline (call for papers, registration) falls in the next 90 days.</w:t>
+        <w:rPr>
+          <w:color w:val="23466B"/>
+        </w:rPr>
+        <w:t>Deadlines in the next 90 days (calls for papers, registration)</w:t>
       </w:r>
     </w:p>
+    <w:tbl>
+      <w:tblPr>
+        <w:tblStyle w:val="TableGrid"/>
+        <w:tblW w:type="auto" w:w="0"/>
+        <w:jc w:val="center"/>
+        <w:tblLayout w:type="fixed"/>
+        <w:tblLook w:firstColumn="1" w:firstRow="1" w:lastColumn="0" w:lastRow="0" w:noHBand="0" w:noVBand="1" w:val="04A0"/>
+      </w:tblPr>
+      <w:tblGrid>
+        <w:gridCol w:w="1474"/>
+        <w:gridCol w:w="1134"/>
+        <w:gridCol w:w="2494"/>
+        <w:gridCol w:w="4535"/>
+      </w:tblGrid>
+      <w:tr>
+        <w:tc>
+          <w:tcPr>
+            <w:tcW w:type="dxa" w:w="1474"/>
+            <w:shd w:val="clear" w:color="auto" w:fill="16324F"/>
+          </w:tcPr>
+          <w:p>
+            <w:r/>
+            <w:r>
+              <w:rPr>
+                <w:b/>
+                <w:color w:val="FFFFFF"/>
+                <w:sz w:val="19"/>
+              </w:rPr>
+              <w:t>Deadline</w:t>
+            </w:r>
+          </w:p>
+        </w:tc>
+        <w:tc>
+          <w:tcPr>
+            <w:tcW w:type="dxa" w:w="1134"/>
+            <w:shd w:val="clear" w:color="auto" w:fill="16324F"/>
+          </w:tcPr>
+          <w:p>
+            <w:r/>
+            <w:r>
+              <w:rPr>
+                <w:b/>
+                <w:color w:val="FFFFFF"/>
+                <w:sz w:val="19"/>
+              </w:rPr>
+              <w:t>Days left</w:t>
+            </w:r>
+          </w:p>
+        </w:tc>
+        <w:tc>
+          <w:tcPr>
+            <w:tcW w:type="dxa" w:w="2494"/>
+            <w:shd w:val="clear" w:color="auto" w:fill="16324F"/>
+          </w:tcPr>
+          <w:p>
+            <w:r/>
+            <w:r>
+              <w:rPr>
+                <w:b/>
+                <w:color w:val="FFFFFF"/>
+                <w:sz w:val="19"/>
+              </w:rPr>
+              <w:t>What is due</w:t>
+            </w:r>
+          </w:p>
+        </w:tc>
+        <w:tc>
+          <w:tcPr>
+            <w:tcW w:type="dxa" w:w="4535"/>
+            <w:shd w:val="clear" w:color="auto" w:fill="16324F"/>
+          </w:tcPr>
+          <w:p>
+            <w:r/>
+            <w:r>
+              <w:rPr>
+                <w:b/>
+                <w:color w:val="FFFFFF"/>
+                <w:sz w:val="19"/>
+              </w:rPr>
+              <w:t>Event</w:t>
+            </w:r>
+          </w:p>
+        </w:tc>
+      </w:tr>
+      <w:tr>
+        <w:tc>
+          <w:tcPr>
+            <w:tcW w:type="dxa" w:w="1474"/>
+          </w:tcPr>
+          <w:p>
+            <w:r/>
+            <w:r>
+              <w:rPr>
+                <w:sz w:val="19"/>
+              </w:rPr>
+              <w:t>11 Dec 2026</w:t>
+            </w:r>
+          </w:p>
+        </w:tc>
+        <w:tc>
+          <w:tcPr>
+            <w:tcW w:type="dxa" w:w="1134"/>
+          </w:tcPr>
+          <w:p>
+            <w:r/>
+            <w:r>
+              <w:rPr>
+                <w:sz w:val="19"/>
+              </w:rPr>
+              <w:t>47</w:t>
+            </w:r>
+          </w:p>
+        </w:tc>
+        <w:tc>
+          <w:tcPr>
+            <w:tcW w:type="dxa" w:w="2494"/>
+          </w:tcPr>
+          <w:p>
+            <w:r/>
+            <w:r>
+              <w:rPr>
+                <w:sz w:val="19"/>
+              </w:rPr>
+              <w:t>Notification of accepted abstracts</w:t>
+            </w:r>
+          </w:p>
+        </w:tc>
+        <w:tc>
+          <w:tcPr>
+            <w:tcW w:type="dxa" w:w="4535"/>
+          </w:tcPr>
+          <w:p>
+            <w:r/>
+            <w:r>
+              <w:rPr>
+                <w:sz w:val="19"/>
+              </w:rPr>
+              <w:t>NUMGE 2027</w:t>
+            </w:r>
+          </w:p>
+        </w:tc>
+      </w:tr>
+    </w:tbl>
+    <w:p/>
     <w:p>
       <w:pPr>
         <w:pStyle w:val="Heading2"/>
@@ -3599,7 +3749,7 @@
               <w:rPr>
                 <w:sz w:val="19"/>
               </w:rPr>
-              <w:t>1 Mar 2027</w:t>
+              <w:t>26 Oct 2026</w:t>
             </w:r>
           </w:p>
         </w:tc>
@@ -3613,7 +3763,7 @@
               <w:rPr>
                 <w:sz w:val="19"/>
               </w:rPr>
-              <w:t>Geo-Congress 2027, part of ASCE2027</w:t>
+              <w:t>Slope Stability 2026 – Slope for Safety Performance – an ISRM Specialized Conference</w:t>
             </w:r>
           </w:p>
         </w:tc>
@@ -3627,7 +3777,7 @@
               <w:rPr>
                 <w:sz w:val="19"/>
               </w:rPr>
-              <w:t>Philadelphia, United States</w:t>
+              <w:t>Lima, Peru</w:t>
             </w:r>
           </w:p>
         </w:tc>
@@ -3658,7 +3808,7 @@
               <w:rPr>
                 <w:sz w:val="19"/>
               </w:rPr>
-              <w:t>12 Apr 2027</w:t>
+              <w:t>2 Nov 2026</w:t>
             </w:r>
           </w:p>
         </w:tc>
@@ -3673,7 +3823,7 @@
               <w:rPr>
                 <w:sz w:val="19"/>
               </w:rPr>
-              <w:t>2nd International Symposium on Ground Improvement</w:t>
+              <w:t>DFI's 51st Annual Conference on Deep Foundations</w:t>
             </w:r>
           </w:p>
         </w:tc>
@@ -3688,7 +3838,127 @@
               <w:rPr>
                 <w:sz w:val="19"/>
               </w:rPr>
-              <w:t>Lyon, France</w:t>
+              <w:t>Orlando, United States</w:t>
+            </w:r>
+          </w:p>
+        </w:tc>
+        <w:tc>
+          <w:tcPr>
+            <w:tcW w:type="dxa" w:w="1701"/>
+            <w:shd w:val="clear" w:color="auto" w:fill="F3F5F7"/>
+          </w:tcPr>
+          <w:p>
+            <w:r/>
+            <w:r>
+              <w:rPr>
+                <w:sz w:val="19"/>
+              </w:rPr>
+              <w:t>Other conference</w:t>
+            </w:r>
+          </w:p>
+        </w:tc>
+      </w:tr>
+      <w:tr>
+        <w:tc>
+          <w:tcPr>
+            <w:tcW w:type="dxa" w:w="1361"/>
+          </w:tcPr>
+          <w:p>
+            <w:r/>
+            <w:r>
+              <w:rPr>
+                <w:sz w:val="19"/>
+              </w:rPr>
+              <w:t>4 Nov 2026</w:t>
+            </w:r>
+          </w:p>
+        </w:tc>
+        <w:tc>
+          <w:tcPr>
+            <w:tcW w:type="dxa" w:w="4535"/>
+          </w:tcPr>
+          <w:p>
+            <w:r/>
+            <w:r>
+              <w:rPr>
+                <w:sz w:val="19"/>
+              </w:rPr>
+              <w:t>2026 Geotechnical Engineering Proceedings Lecture: Strains in sprayed concrete tunnel linings at Heathrow Terminal 4 and back-calculation of stress</w:t>
+            </w:r>
+          </w:p>
+        </w:tc>
+        <w:tc>
+          <w:tcPr>
+            <w:tcW w:type="dxa" w:w="2041"/>
+          </w:tcPr>
+          <w:p>
+            <w:r/>
+            <w:r>
+              <w:rPr>
+                <w:sz w:val="19"/>
+              </w:rPr>
+              <w:t>London, United Kingdom</w:t>
+            </w:r>
+          </w:p>
+        </w:tc>
+        <w:tc>
+          <w:tcPr>
+            <w:tcW w:type="dxa" w:w="1701"/>
+          </w:tcPr>
+          <w:p>
+            <w:r/>
+            <w:r>
+              <w:rPr>
+                <w:sz w:val="19"/>
+              </w:rPr>
+              <w:t>Course / webinar</w:t>
+            </w:r>
+          </w:p>
+        </w:tc>
+      </w:tr>
+      <w:tr>
+        <w:tc>
+          <w:tcPr>
+            <w:tcW w:type="dxa" w:w="1361"/>
+            <w:shd w:val="clear" w:color="auto" w:fill="F3F5F7"/>
+          </w:tcPr>
+          <w:p>
+            <w:r/>
+            <w:r>
+              <w:rPr>
+                <w:sz w:val="19"/>
+              </w:rPr>
+              <w:t>4 Nov 2026</w:t>
+            </w:r>
+          </w:p>
+        </w:tc>
+        <w:tc>
+          <w:tcPr>
+            <w:tcW w:type="dxa" w:w="4535"/>
+            <w:shd w:val="clear" w:color="auto" w:fill="F3F5F7"/>
+          </w:tcPr>
+          <w:p>
+            <w:r/>
+            <w:r>
+              <w:rPr>
+                <w:sz w:val="19"/>
+              </w:rPr>
+              <w:t>International Conference on Performance-Based Design in Earthquake Geotechnical Engineering</w:t>
+            </w:r>
+          </w:p>
+        </w:tc>
+        <w:tc>
+          <w:tcPr>
+            <w:tcW w:type="dxa" w:w="2041"/>
+            <w:shd w:val="clear" w:color="auto" w:fill="F3F5F7"/>
+          </w:tcPr>
+          <w:p>
+            <w:r/>
+            <w:r>
+              <w:rPr>
+                <w:sz w:val="19"/>
+              </w:rPr>
+              <w:t>Puerto Varas, Chile</w:t>
             </w:r>
           </w:p>
         </w:tc>
@@ -3719,7 +3989,7 @@
               <w:rPr>
                 <w:sz w:val="19"/>
               </w:rPr>
-              <w:t>23 Apr 2027</w:t>
+              <w:t>10 Nov 2026</w:t>
             </w:r>
           </w:p>
         </w:tc>
@@ -3733,7 +4003,7 @@
               <w:rPr>
                 <w:sz w:val="19"/>
               </w:rPr>
-              <w:t>ITA-AITES World Tunnel Congress 2027</w:t>
+              <w:t>BGA ECG Advanced Laboratory Testing &amp; Dynamic Behaviour of Soils</w:t>
             </w:r>
           </w:p>
         </w:tc>
@@ -3747,7 +4017,247 @@
               <w:rPr>
                 <w:sz w:val="19"/>
               </w:rPr>
-              <w:t>Antwerp, Belgium</w:t>
+              <w:t>Online</w:t>
+            </w:r>
+          </w:p>
+        </w:tc>
+        <w:tc>
+          <w:tcPr>
+            <w:tcW w:type="dxa" w:w="1701"/>
+          </w:tcPr>
+          <w:p>
+            <w:r/>
+            <w:r>
+              <w:rPr>
+                <w:sz w:val="19"/>
+              </w:rPr>
+              <w:t>Course / webinar</w:t>
+            </w:r>
+          </w:p>
+        </w:tc>
+      </w:tr>
+      <w:tr>
+        <w:tc>
+          <w:tcPr>
+            <w:tcW w:type="dxa" w:w="1361"/>
+            <w:shd w:val="clear" w:color="auto" w:fill="F3F5F7"/>
+          </w:tcPr>
+          <w:p>
+            <w:r/>
+            <w:r>
+              <w:rPr>
+                <w:sz w:val="19"/>
+              </w:rPr>
+              <w:t>10 Nov 2026</w:t>
+            </w:r>
+          </w:p>
+        </w:tc>
+        <w:tc>
+          <w:tcPr>
+            <w:tcW w:type="dxa" w:w="4535"/>
+            <w:shd w:val="clear" w:color="auto" w:fill="F3F5F7"/>
+          </w:tcPr>
+          <w:p>
+            <w:r/>
+            <w:r>
+              <w:rPr>
+                <w:sz w:val="19"/>
+              </w:rPr>
+              <w:t>ITACET Lunchtime Lecture Series #60</w:t>
+            </w:r>
+          </w:p>
+        </w:tc>
+        <w:tc>
+          <w:tcPr>
+            <w:tcW w:type="dxa" w:w="2041"/>
+            <w:shd w:val="clear" w:color="auto" w:fill="F3F5F7"/>
+          </w:tcPr>
+          <w:p>
+            <w:r/>
+            <w:r>
+              <w:rPr>
+                <w:sz w:val="19"/>
+              </w:rPr>
+              <w:t>—</w:t>
+            </w:r>
+          </w:p>
+        </w:tc>
+        <w:tc>
+          <w:tcPr>
+            <w:tcW w:type="dxa" w:w="1701"/>
+            <w:shd w:val="clear" w:color="auto" w:fill="F3F5F7"/>
+          </w:tcPr>
+          <w:p>
+            <w:r/>
+            <w:r>
+              <w:rPr>
+                <w:sz w:val="19"/>
+              </w:rPr>
+              <w:t>Course / webinar</w:t>
+            </w:r>
+          </w:p>
+        </w:tc>
+      </w:tr>
+      <w:tr>
+        <w:tc>
+          <w:tcPr>
+            <w:tcW w:type="dxa" w:w="1361"/>
+          </w:tcPr>
+          <w:p>
+            <w:r/>
+            <w:r>
+              <w:rPr>
+                <w:sz w:val="19"/>
+              </w:rPr>
+              <w:t>10 Nov 2026</w:t>
+            </w:r>
+          </w:p>
+        </w:tc>
+        <w:tc>
+          <w:tcPr>
+            <w:tcW w:type="dxa" w:w="4535"/>
+          </w:tcPr>
+          <w:p>
+            <w:r/>
+            <w:r>
+              <w:rPr>
+                <w:sz w:val="19"/>
+              </w:rPr>
+              <w:t>Woh Hup Distinguished Lecture by Prof. Kenichi Soga</w:t>
+            </w:r>
+          </w:p>
+        </w:tc>
+        <w:tc>
+          <w:tcPr>
+            <w:tcW w:type="dxa" w:w="2041"/>
+          </w:tcPr>
+          <w:p>
+            <w:r/>
+            <w:r>
+              <w:rPr>
+                <w:sz w:val="19"/>
+              </w:rPr>
+              <w:t>—</w:t>
+            </w:r>
+          </w:p>
+        </w:tc>
+        <w:tc>
+          <w:tcPr>
+            <w:tcW w:type="dxa" w:w="1701"/>
+          </w:tcPr>
+          <w:p>
+            <w:r/>
+            <w:r>
+              <w:rPr>
+                <w:sz w:val="19"/>
+              </w:rPr>
+              <w:t>Course / webinar</w:t>
+            </w:r>
+          </w:p>
+        </w:tc>
+      </w:tr>
+      <w:tr>
+        <w:tc>
+          <w:tcPr>
+            <w:tcW w:type="dxa" w:w="1361"/>
+            <w:shd w:val="clear" w:color="auto" w:fill="F3F5F7"/>
+          </w:tcPr>
+          <w:p>
+            <w:r/>
+            <w:r>
+              <w:rPr>
+                <w:sz w:val="19"/>
+              </w:rPr>
+              <w:t>12 Nov 2026</w:t>
+            </w:r>
+          </w:p>
+        </w:tc>
+        <w:tc>
+          <w:tcPr>
+            <w:tcW w:type="dxa" w:w="4535"/>
+            <w:shd w:val="clear" w:color="auto" w:fill="F3F5F7"/>
+          </w:tcPr>
+          <w:p>
+            <w:r/>
+            <w:r>
+              <w:rPr>
+                <w:sz w:val="19"/>
+              </w:rPr>
+              <w:t>10th Conference of the Croatian Geotechnical Society: Geotechnical Engineering in Soft Rocks and Heterogeneous Rock Masses – an ISRM Specialized Conference</w:t>
+            </w:r>
+          </w:p>
+        </w:tc>
+        <w:tc>
+          <w:tcPr>
+            <w:tcW w:type="dxa" w:w="2041"/>
+            <w:shd w:val="clear" w:color="auto" w:fill="F3F5F7"/>
+          </w:tcPr>
+          <w:p>
+            <w:r/>
+            <w:r>
+              <w:rPr>
+                <w:sz w:val="19"/>
+              </w:rPr>
+              <w:t>Split, Croatia</w:t>
+            </w:r>
+          </w:p>
+        </w:tc>
+        <w:tc>
+          <w:tcPr>
+            <w:tcW w:type="dxa" w:w="1701"/>
+            <w:shd w:val="clear" w:color="auto" w:fill="F3F5F7"/>
+          </w:tcPr>
+          <w:p>
+            <w:r/>
+            <w:r>
+              <w:rPr>
+                <w:sz w:val="19"/>
+              </w:rPr>
+              <w:t>Other conference</w:t>
+            </w:r>
+          </w:p>
+        </w:tc>
+      </w:tr>
+      <w:tr>
+        <w:tc>
+          <w:tcPr>
+            <w:tcW w:type="dxa" w:w="1361"/>
+          </w:tcPr>
+          <w:p>
+            <w:r/>
+            <w:r>
+              <w:rPr>
+                <w:sz w:val="19"/>
+              </w:rPr>
+              <w:t>12 Nov 2026</w:t>
+            </w:r>
+          </w:p>
+        </w:tc>
+        <w:tc>
+          <w:tcPr>
+            <w:tcW w:type="dxa" w:w="4535"/>
+          </w:tcPr>
+          <w:p>
+            <w:r/>
+            <w:r>
+              <w:rPr>
+                <w:sz w:val="19"/>
+              </w:rPr>
+              <w:t>Tunnel Turkey 2026</w:t>
+            </w:r>
+          </w:p>
+        </w:tc>
+        <w:tc>
+          <w:tcPr>
+            <w:tcW w:type="dxa" w:w="2041"/>
+          </w:tcPr>
+          <w:p>
+            <w:r/>
+            <w:r>
+              <w:rPr>
+                <w:sz w:val="19"/>
+              </w:rPr>
+              <w:t>Türkiye</w:t>
             </w:r>
           </w:p>
         </w:tc>
@@ -3778,7 +4288,7 @@
               <w:rPr>
                 <w:sz w:val="19"/>
               </w:rPr>
-              <w:t>28 Jun 2027</w:t>
+              <w:t>17 Nov 2026</w:t>
             </w:r>
           </w:p>
         </w:tc>
@@ -3793,7 +4303,7 @@
               <w:rPr>
                 <w:sz w:val="19"/>
               </w:rPr>
-              <w:t>International Conference on Sustainability in Geotechnical Engineering</w:t>
+              <w:t>BGA Touring Lecture – Beyond Automation: Responsible AI Workflows in Geotechnical Modelling and Monitoring</w:t>
             </w:r>
           </w:p>
         </w:tc>
@@ -3808,7 +4318,7 @@
               <w:rPr>
                 <w:sz w:val="19"/>
               </w:rPr>
-              <w:t>Lisbon, Portugal</w:t>
+              <w:t>Leeds, United Kingdom</w:t>
             </w:r>
           </w:p>
         </w:tc>
@@ -3823,65 +4333,7 @@
               <w:rPr>
                 <w:sz w:val="19"/>
               </w:rPr>
-              <w:t>ISSMGE-supported</w:t>
-            </w:r>
-          </w:p>
-        </w:tc>
-      </w:tr>
-      <w:tr>
-        <w:tc>
-          <w:tcPr>
-            <w:tcW w:type="dxa" w:w="1361"/>
-          </w:tcPr>
-          <w:p>
-            <w:r/>
-            <w:r>
-              <w:rPr>
-                <w:sz w:val="19"/>
-              </w:rPr>
-              <w:t>14 Sep 2027</w:t>
-            </w:r>
-          </w:p>
-        </w:tc>
-        <w:tc>
-          <w:tcPr>
-            <w:tcW w:type="dxa" w:w="4535"/>
-          </w:tcPr>
-          <w:p>
-            <w:r/>
-            <w:r>
-              <w:rPr>
-                <w:sz w:val="19"/>
-              </w:rPr>
-              <w:t>9th International Symposium on Deformation Characteristics of Geomaterials</w:t>
-            </w:r>
-          </w:p>
-        </w:tc>
-        <w:tc>
-          <w:tcPr>
-            <w:tcW w:type="dxa" w:w="2041"/>
-          </w:tcPr>
-          <w:p>
-            <w:r/>
-            <w:r>
-              <w:rPr>
-                <w:sz w:val="19"/>
-              </w:rPr>
-              <w:t>Ankara, Türkiye</w:t>
-            </w:r>
-          </w:p>
-        </w:tc>
-        <w:tc>
-          <w:tcPr>
-            <w:tcW w:type="dxa" w:w="1701"/>
-          </w:tcPr>
-          <w:p>
-            <w:r/>
-            <w:r>
-              <w:rPr>
-                <w:sz w:val="19"/>
-              </w:rPr>
-              <w:t>ISSMGE-supported</w:t>
+              <w:t>Course / webinar</w:t>
             </w:r>
           </w:p>
         </w:tc>

</xml_diff>

<commit_message>
Lower running costs: Sonnet for the assistant and events, Haiku for linking
The AI assistant starts on Claude Sonnet (Opus and Haiku stay selectable),
developing stories are linked with Claude Haiku, and the events calendar is
refreshed every 14 days with Claude Sonnet. The issue brief stays on Opus
and the scan stays daily. The README lists what each part costs.

Co-Authored-By: Claude Opus 5.5 <noreply@anthropic.com>
Claude-Session: https://claude.ai/code/session_01N2cbJQGUUZpwz34g4NBxNT
</commit_message>
<xml_diff>
--- a/docs/reports/site-report.docx
+++ b/docs/reports/site-report.docx
@@ -28,7 +28,7 @@
           <w:color w:val="5B6573"/>
           <w:sz w:val="19"/>
         </w:rPr>
-        <w:t>ISSMGE Magazine · generated 25 October 2026, 07:17 UTC · updated automatically after every scan</w:t>
+        <w:t>ISSMGE Magazine · generated 25 October 2026, 07:31 UTC · updated automatically after every scan</w:t>
       </w:r>
     </w:p>
     <w:p>
@@ -4879,6 +4879,34 @@
           <w:b/>
           <w:color w:val="23466B"/>
         </w:rPr>
+        <w:t>2026-10-25 · Lower running costs</w:t>
+      </w:r>
+    </w:p>
+    <w:p>
+      <w:pPr>
+        <w:pStyle w:val="ListBullet"/>
+      </w:pPr>
+      <w:r>
+        <w:t>The AI assistant now starts on Claude Sonnet (half the cost of Opus, still good answers); Opus and Haiku can still be chosen per question.</w:t>
+      </w:r>
+    </w:p>
+    <w:p>
+      <w:pPr>
+        <w:pStyle w:val="ListBullet"/>
+      </w:pPr>
+      <w:r>
+        <w:t>Developing stories are linked with Claude Haiku, the lowest-cost model, and the events calendar is refreshed every 14 days with Claude Sonnet. The issue brief stays on Claude Opus. The daily scan stays daily. The README lists what each part costs.</w:t>
+      </w:r>
+    </w:p>
+    <w:p>
+      <w:pPr>
+        <w:spacing w:before="160"/>
+      </w:pPr>
+      <w:r>
+        <w:rPr>
+          <w:b/>
+          <w:color w:val="23466B"/>
+        </w:rPr>
         <w:t>2026-10-25 · Catch-up scans and a cheaper events refresh</w:t>
       </w:r>
     </w:p>

</xml_diff>